<commit_message>
fix: align chapter 5 sections 5-4 and 5-5 with mission structure
</commit_message>
<xml_diff>
--- a/output/final/chapter5_simulated_real_pipeline.docx
+++ b/output/final/chapter5_simulated_real_pipeline.docx
@@ -744,7 +744,7 @@
           <w:rtl/>
           <w:lang w:bidi="fa-IR"/>
         </w:rPr>
-        <w:t xml:space="preserve">۵-۴. نتیجه‌گیری کلی</w:t>
+        <w:t xml:space="preserve">۵-۴. همسویی و ناهمسویی یافته‌ها با پیشینه پژوهش</w:t>
       </w:r>
     </w:p>
     <w:p>
@@ -761,7 +761,7 @@
           <w:rtl/>
           <w:lang w:bidi="fa-IR"/>
         </w:rPr>
-        <w:t xml:space="preserve">پژوهش حاضر نشان داد که اضطراب صفتی هم مستقیم و هم غیرمستقیم — از مسیر طرحواره‌های ناسازگار اولیه — با رفتارهای مالی پرخطر معامله‌گران پیوند دارد و هر چهار فرضیه آن تأیید شد. سهم نظری این پژوهش در آن است که مدل آسیب‌پذیری-استرس را به بستر بازارهای مالی گسترش می‌دهد و سازوکار شناختی مشخصی (طرحواره‌ها) را برای پیوندی معرفی می‌کند که پیش‌تر عمدتاً در سطح همبستگی مستند شده بود (زاکرمن، ۱۹۹۹؛ بک، ۱۹۷۶). این‌که قوی‌ترین حلقه زنجیره، پیوند اضطراب با طرحواره‌ها (۰٫۵۰۱) بود و پیوندهای سطح رفتار کوچک تا متوسط باقی ماندند، نشان می‌دهد که فاصله میان ویژگی هیجانی و عمل مالی، دست‌کم تا حدی از گذرگاه شناخت پُر می‌شود.</w:t>
+        <w:t xml:space="preserve">الگوی کلی یافته‌ها با پیشینه نظری و تجربی همسوست. در سطح نظری، زنجیره اضطراب-طرحواره-رفتار با مدل شناختی اضطراب (بک و کلارک، ۱۹۹۷)، نظریه کنترل توجه (آیزنک و همکاران، ۲۰۰۷)، مدل طرحواره (یانگ و همکاران، ۲۰۰۳) و منطق آسیب‌پذیری-استرس (زاکرمن، ۱۹۹۹) سازگار است و قوی‌ترین حلقه آن (رابطه ۰٫۵۰۱ اضطراب با طرحواره‌ها) دقیقاً همان پیوندی است که این نظریه‌ها کانونی می‌دانند. در سطح تجربی خارجی، یافته میانجی‌گری با سابقه اثر غیرمستقیم عوامل روانی از مسیر تحمل ریسک (سافیتری و همکاران، ۲۰۲۵) و شکل‌پذیری نگرش به ریسک در مداخله‌های شناختی (اولولو و همکاران، ۲۰۲۴) هم‌جهت است و پیوند طرحواره‌ها با رفتارهای پرخطر نیز با شواهد شوری و همکاران (۲۰۱۲) و مرور ویرا و همکاران (۲۰۲۳) همسوست. در پیشینه داخلی نیز هر چهار یافته، همتای همسو دارند: پیوند شخصیت با رفتار معاملاتی (ستایش و همکاران، ۱۳۹۹)، اثر ویژگی‌های فردی بر رفتار توده‌وار (بهدیو و همکاران، ۱۳۹۸)، پیوند سبک تصمیم‌گیری با عملکرد (فلاح و خدایی، ۱۳۹۸)، نقش سواد مالی (فروغی و تهرانی، ۱۳۹۷) و پیوند طرحواره‌ها با اضطراب و رفتار مسئله‌ساز (نوری و هاشمیان، ۱۳۹۶؛ امیدی و همکاران، ۱۳۹۲).</w:t>
       </w:r>
     </w:p>
     <w:p>
@@ -778,7 +778,7 @@
           <w:rtl/>
           <w:lang w:bidi="fa-IR"/>
         </w:rPr>
-        <w:t xml:space="preserve">در سطح سنجش نیز پژوهش حاضر بر پیوند مفهومی تحمل ریسک با رفتار پرخطر تکیه کرد؛ پیوندی که از ابتدا مبنای ساخت مقیاس گرابل و لایتون (۱۹۹۹) بوده است. نمره بالاتر در این مقیاس، تمایل بالاتر به پذیرش ریسک و در نتیجه بروز بیشتر رفتارهای پرخطر را نشان می‌دهد و یافته‌های پژوهش — از جمله همبستگی‌های مثبت معنادار و الگوی میانجی‌گری — با همین خوانش عملیاتی سازگارند. با این حال، چنان‌که در بخش محدودیت‌ها خواهد آمد، اتکا به یک ابزار واحد برای سنجش پیامد، احتیاط در تعمیم را ایجاب می‌کند.</w:t>
+        <w:t xml:space="preserve">ناهمسویی اصلی، در فرضیه دوم و در اندازه‌اثرهای سطح رفتار دیده می‌شود. اثر منفی اضطراب صفتی بر تصمیم سرمایه‌گذاری (ماهاتو و همکاران، ۲۰۲۵)، اجتناب از ریسک در افراد مضطرب (منر و اشمیت، ۲۰۰۶) و مشروط بودن پیوند صفات با تصمیم پرخطر (لاوریولا و لوین، ۲۰۰۱) با رابطه مثبت ۰٫۳۲۷ این پژوهش در تنش‌اند. این تنش، چنان‌که در بخش ۵-۳-۲ بحث شد، با تفکیک «نگرش به ریسک» از «رفتار پرخطر» قابل رفع است: اضطراب می‌تواند همزمان نگرش را محتاط و رفتار معاملاتی را تکانشی کند. همچنین کوچک تا متوسط بودن اثرها در سطح رفتار (۰٫۳۲۷ و ۰٫۳۲۱ در برابر ۰٫۵۰۱ در سطح شناخت) خود یک یافته مرزی است: مدل‌های شناختی-هیجانی، رفتار مالی را تبیین می‌کنند اما به‌تنهایی آن را تعیین نمی‌کنند. در سطح سنجش نیز یافته‌ها با خوانش عملیاتی مقیاس گرابل و لایتون (۱۹۹۹) سازگارند: نمره بالاتر به معنای تحمل ریسک بیشتر و تمایل بالاتر به رفتار پرخطر است و همبستگی‌های مثبت معنادار و الگوی میانجی‌گری به‌دست‌آمده با همین خوانش هم‌جهت‌اند.</w:t>
       </w:r>
     </w:p>
     <w:p>
@@ -797,7 +797,7 @@
           <w:rtl/>
           <w:lang w:bidi="fa-IR"/>
         </w:rPr>
-        <w:t xml:space="preserve">۵-۵. کاربردهای عملی یافته‌ها</w:t>
+        <w:t xml:space="preserve">۵-۵. دلالت‌های کاربردی</w:t>
       </w:r>
     </w:p>
     <w:p>

</xml_diff>